<commit_message>
Drop the .NET version number from the resume
Replace ".NET 8" / "ASP.NET Core 8" with version-less ".NET" so the PDF
does not go stale as new runtimes ship. Also sync the checked-in .docx
with the actual source of the published PDF.

Co-Authored-By: Claude Fable 5.1 <noreply@anthropic.com>
</commit_message>
<xml_diff>
--- a/public/assets/documents/Revanza_Raytama_Resume_final.docx
+++ b/public/assets/documents/Revanza_Raytama_Resume_final.docx
@@ -100,7 +100,7 @@
           <w:rPr>
             <w:rStyle w:val="Hyperlink"/>
           </w:rPr>
-          <w:t>DNDMind Demo</w:t>
+          <w:t>Portfolio</w:t>
         </w:r>
       </w:hyperlink>
     </w:p>
@@ -124,14 +124,7 @@
         </w:rPr>
       </w:pPr>
       <w:r>
-        <w:t>Senior Backend Engineer / Acting Tech Lead with 8+ years of experience building enterprise-grade backend systems, data integration services, internal productivity platforms, and AI/LLM-enabled applications. Strong in backend architecture, API design, relational databases, asynchronous processing, Docker-based deployment, cloud infrastructure, and technical leadership. Proven track record delivering systems across LNG operations, procurement, risk, reporting, financial workflows, and executive decision support. Experienced in LLM/RAG integration using backend inference services, prompt orchestration, embedding pipelines, vector retrieval, and enterprise UI integration.</w:t>
-      </w:r>
-      <w:r>
-        <w:rPr>
-          <w:sz w:val="22"/>
-          <w:szCs w:val="22"/>
-        </w:rPr>
-        <w:br/>
+        <w:t xml:space="preserve">Senior Backend &amp; AI Systems Engineer with 8+ years building enterprise backend platforms, data pipelines, and production AI features in regulated energy, telecom, and insurance environments. At a Pertamina subsidiary, leads technical delivery across 7 cross-functional squads and vendor developers. Took an on-premise RAG assistant into production use and co-founded MeatLink, a live B2B commerce platform with an OAuth-protected MCP server for AI agents. Strong in .NET, Laravel/PHP, Python, TypeScript, SQL Server/PostgreSQL, Airflow/Spark, and Docker, with a daily AI-assisted workflow (Claude Code, OpenAI Codex).</w:t>
       </w:r>
     </w:p>
     <w:p>
@@ -172,7 +165,7 @@
           <w:b/>
           <w:bCs/>
         </w:rPr>
-        <w:t>PT Nusantara Regas — Pertamina Subsidiary / SOE Energy Company</w:t>
+        <w:t xml:space="preserve">PT Nusantara Regas — Pertamina Subsidiary / SOE Energy Company</w:t>
       </w:r>
     </w:p>
     <w:p>
@@ -189,7 +182,7 @@
         <w:rPr>
           <w:rStyle w:val="Strong"/>
         </w:rPr>
-        <w:t>Senior Software Engineer (Acting Tech Lead)</w:t>
+        <w:t>Senior Software Engineer</w:t>
       </w:r>
       <w:r>
         <w:t xml:space="preserve"> | </w:t>
@@ -218,10 +211,43 @@
         </w:rPr>
       </w:pPr>
       <w:r>
-        <w:t>Delivered enterprise systems in a Microsoft-heavy hybrid environment using SQL Server, Power BI/Fabric, Windows Server/IIS, Azure services, ASP.NET/.NET, and selected Laravel/PHP applications.</w:t>
+        <w:rPr>
+          <w:color w:val="000000"/>
+          <w:lang w:val="en-ID"/>
+        </w:rPr>
+        <w:t xml:space="preserve">Lead technical delivery of internal platforms for LNG operations, procurement, CSR, risk, and executive reporting on </w:t>
       </w:r>
       <w:r>
-        <w:t xml:space="preserve"> </w:t>
+        <w:rPr>
+          <w:b/>
+          <w:bCs/>
+          <w:color w:val="000000"/>
+          <w:lang w:val="en-ID"/>
+        </w:rPr>
+        <w:t xml:space="preserve">ASP.NET Core/.NET</w:t>
+      </w:r>
+      <w:r>
+        <w:rPr>
+          <w:color w:val="000000"/>
+          <w:lang w:val="en-ID"/>
+        </w:rPr>
+        <w:t xml:space="preserve">, </w:t>
+      </w:r>
+      <w:r>
+        <w:rPr>
+          <w:b/>
+          <w:bCs/>
+          <w:color w:val="000000"/>
+          <w:lang w:val="en-ID"/>
+        </w:rPr>
+        <w:t xml:space="preserve">Laravel/PHP</w:t>
+      </w:r>
+      <w:r>
+        <w:rPr>
+          <w:color w:val="000000"/>
+          <w:lang w:val="en-ID"/>
+        </w:rPr>
+        <w:t xml:space="preserve">, SQL Server, Oracle, PostgreSQL, IIS, Azure, and Docker.</w:t>
       </w:r>
     </w:p>
     <w:p>
@@ -242,58 +268,19 @@
       </w:pPr>
       <w:r>
         <w:rPr>
-          <w:color w:val="000000"/>
-          <w:lang w:val="en-ID"/>
-        </w:rPr>
-        <w:t xml:space="preserve">Designed </w:t>
-      </w:r>
-      <w:r>
-        <w:rPr>
           <w:b/>
           <w:bCs/>
           <w:color w:val="000000"/>
           <w:lang w:val="en-ID"/>
         </w:rPr>
-        <w:t>backend architecture</w:t>
+        <w:t xml:space="preserve">Led 7 cross-functional Agile squads</w:t>
       </w:r>
       <w:r>
         <w:rPr>
           <w:color w:val="000000"/>
           <w:lang w:val="en-ID"/>
         </w:rPr>
-        <w:t xml:space="preserve"> for </w:t>
-      </w:r>
-      <w:r>
-        <w:rPr>
-          <w:b/>
-          <w:bCs/>
-          <w:color w:val="000000"/>
-          <w:lang w:val="en-ID"/>
-        </w:rPr>
-        <w:t>mission-critical internal enterprise platforms</w:t>
-      </w:r>
-      <w:r>
-        <w:rPr>
-          <w:color w:val="000000"/>
-          <w:lang w:val="en-ID"/>
-        </w:rPr>
-        <w:t xml:space="preserve"> supporting operations, procurement, risk, reporting, and </w:t>
-      </w:r>
-      <w:r>
-        <w:rPr>
-          <w:b/>
-          <w:bCs/>
-          <w:color w:val="000000"/>
-          <w:lang w:val="en-ID"/>
-        </w:rPr>
-        <w:t>executive decision-support workflows</w:t>
-      </w:r>
-      <w:r>
-        <w:rPr>
-          <w:color w:val="000000"/>
-          <w:lang w:val="en-ID"/>
-        </w:rPr>
-        <w:t>.</w:t>
+        <w:t xml:space="preserve"> and vendor developers through the full SDLC, from architecture and code review to deployment and operational governance; set backend integration and coding standards and mentored junior and mid-level engineers.</w:t>
       </w:r>
     </w:p>
     <w:p>
@@ -313,27 +300,59 @@
         </w:rPr>
       </w:pPr>
       <w:r>
-        <w:t xml:space="preserve">Architected and deployed an </w:t>
+        <w:rPr>
+          <w:color w:val="000000"/>
+          <w:lang w:val="en-ID"/>
+        </w:rPr>
+        <w:t xml:space="preserve">Architected an </w:t>
       </w:r>
       <w:r>
         <w:rPr>
           <w:b/>
           <w:bCs/>
+          <w:color w:val="000000"/>
+          <w:lang w:val="en-ID"/>
         </w:rPr>
-        <w:t>on-premise LLM-powered internal knowledge assistant</w:t>
+        <w:t xml:space="preserve">on-premise LLM knowledge assistant</w:t>
       </w:r>
       <w:r>
-        <w:t xml:space="preserve"> integrated with backend inference services and enterprise UI systems. Redesigned it into a </w:t>
+        <w:rPr>
+          <w:color w:val="000000"/>
+          <w:lang w:val="en-ID"/>
+        </w:rPr>
+        <w:t xml:space="preserve"> over internal documents and SOPs and redesigned it into a </w:t>
       </w:r>
       <w:r>
         <w:rPr>
           <w:b/>
           <w:bCs/>
+          <w:color w:val="000000"/>
+          <w:lang w:val="en-ID"/>
         </w:rPr>
-        <w:t>RAG pipeline</w:t>
+        <w:t xml:space="preserve">RAG pipeline</w:t>
       </w:r>
       <w:r>
-        <w:t xml:space="preserve"> using document chunking, embedding generation, vector retrieval, contextual prompt orchestration, and response/output handling to improve answer accuracy and reduce hallucination risk.</w:t>
+        <w:rPr>
+          <w:color w:val="000000"/>
+          <w:lang w:val="en-ID"/>
+        </w:rPr>
+        <w:t xml:space="preserve"> (chunking, embeddings, vector retrieval, prompt orchestration, controlled output handling), taking it into </w:t>
+      </w:r>
+      <w:r>
+        <w:rPr>
+          <w:b/>
+          <w:bCs/>
+          <w:color w:val="000000"/>
+          <w:lang w:val="en-ID"/>
+        </w:rPr>
+        <w:t xml:space="preserve">production use</w:t>
+      </w:r>
+      <w:r>
+        <w:rPr>
+          <w:color w:val="000000"/>
+          <w:lang w:val="en-ID"/>
+        </w:rPr>
+        <w:t xml:space="preserve">; also shipped AI document extraction and summarisation features.</w:t>
       </w:r>
     </w:p>
     <w:p>
@@ -353,10 +372,27 @@
         </w:rPr>
       </w:pPr>
       <w:r>
-        <w:t>Built Apache Airflow pipelines processing multi-source gas operations data into snapshot tables and curated reporting datasets, forming a governed decision-support layer for executive and board-level dashboards.</w:t>
+        <w:rPr>
+          <w:color w:val="000000"/>
+          <w:lang w:val="en-ID"/>
+        </w:rPr>
+        <w:t xml:space="preserve">Led development of </w:t>
       </w:r>
       <w:r>
-        <w:t xml:space="preserve"> </w:t>
+        <w:rPr>
+          <w:b/>
+          <w:bCs/>
+          <w:color w:val="000000"/>
+          <w:lang w:val="en-ID"/>
+        </w:rPr>
+        <w:t xml:space="preserve">NR EMAS</w:t>
+      </w:r>
+      <w:r>
+        <w:rPr>
+          <w:color w:val="000000"/>
+          <w:lang w:val="en-ID"/>
+        </w:rPr>
+        <w:t xml:space="preserve">, a .NET Clean Architecture risk-treatment platform (Blazor, EF Core, Hangfire), directing the developer and owning the production rollout (Docker, Nginx SSL reverse proxy); it replaced Excel-based risk tracking with multi-level approvals, KRI monitoring, and executive dashboards.</w:t>
       </w:r>
     </w:p>
     <w:p>
@@ -376,7 +412,43 @@
         </w:rPr>
       </w:pPr>
       <w:r>
-        <w:t>Created a centralized SQL Server reporting data store by consolidating data copies from 30+ internal application databases, enabling Power BI/Fabric KPI dashboards, reporting automation, and reduced dependency on direct production database queries.</w:t>
+        <w:rPr>
+          <w:color w:val="000000"/>
+          <w:lang w:val="en-ID"/>
+        </w:rPr>
+        <w:t xml:space="preserve">Built an </w:t>
+      </w:r>
+      <w:r>
+        <w:rPr>
+          <w:b/>
+          <w:bCs/>
+          <w:color w:val="000000"/>
+          <w:lang w:val="en-ID"/>
+        </w:rPr>
+        <w:t xml:space="preserve">Apache Airflow + Spark</w:t>
+      </w:r>
+      <w:r>
+        <w:rPr>
+          <w:color w:val="000000"/>
+          <w:lang w:val="en-ID"/>
+        </w:rPr>
+        <w:t xml:space="preserve"> pipeline consolidating three operational databases (PostgreSQL, SQL Server) into a PostgreSQL data mart that feeds </w:t>
+      </w:r>
+      <w:r>
+        <w:rPr>
+          <w:b/>
+          <w:bCs/>
+          <w:color w:val="000000"/>
+          <w:lang w:val="en-ID"/>
+        </w:rPr>
+        <w:t xml:space="preserve">13 executive KPIs</w:t>
+      </w:r>
+      <w:r>
+        <w:rPr>
+          <w:color w:val="000000"/>
+          <w:lang w:val="en-ID"/>
+        </w:rPr>
+        <w:t xml:space="preserve"> (gas send-out, boil-off gas, asset integrity, safety, risk, EBITDA), refreshed twice daily with rerun-safe snapshots and backfills.</w:t>
       </w:r>
     </w:p>
     <w:p>
@@ -400,7 +472,7 @@
           <w:color w:val="000000"/>
           <w:lang w:val="en-ID"/>
         </w:rPr>
-        <w:t xml:space="preserve">Architected end-to-end industrial data pipelines integrating SCADA and FSRU LNG operational systems, eliminating manual Excel workflows and saving </w:t>
+        <w:t xml:space="preserve">Created a centralized SQL Server reporting store consolidating data from </w:t>
       </w:r>
       <w:r>
         <w:rPr>
@@ -409,14 +481,14 @@
           <w:color w:val="000000"/>
           <w:lang w:val="en-ID"/>
         </w:rPr>
-        <w:t>~80 staff-hours per month</w:t>
+        <w:t xml:space="preserve">30+ internal application databases</w:t>
       </w:r>
       <w:r>
         <w:rPr>
           <w:color w:val="000000"/>
           <w:lang w:val="en-ID"/>
         </w:rPr>
-        <w:t>.</w:t>
+        <w:t xml:space="preserve">, enabling Power BI/Fabric KPI dashboards, reducing dependency on direct production queries, and replacing a vendor-heavy implementation with an internal-led build.</w:t>
       </w:r>
     </w:p>
     <w:p>
@@ -437,19 +509,26 @@
       </w:pPr>
       <w:r>
         <w:rPr>
+          <w:color w:val="000000"/>
+          <w:lang w:val="en-ID"/>
+        </w:rPr>
+        <w:t xml:space="preserve">Architected SCADA and FSRU LNG data integrations that eliminated manual Excel workflows, saving </w:t>
+      </w:r>
+      <w:r>
+        <w:rPr>
           <w:b/>
           <w:bCs/>
           <w:color w:val="000000"/>
           <w:lang w:val="en-ID"/>
         </w:rPr>
-        <w:t>Led 7 cross-functional Agile squads</w:t>
+        <w:t xml:space="preserve">~80 staff-hours per month</w:t>
       </w:r>
       <w:r>
         <w:rPr>
           <w:color w:val="000000"/>
           <w:lang w:val="en-ID"/>
         </w:rPr>
-        <w:t>, owning full SDLC across mission-critical LNG systems from architecture design through deployment and operational governance.</w:t>
+        <w:t xml:space="preserve">.</w:t>
       </w:r>
     </w:p>
     <w:p>
@@ -469,14 +548,305 @@
         </w:rPr>
       </w:pPr>
       <w:r>
-        <w:t>Conducted code reviews, mentored junior/mid-level engineers and vendor teams, and established backend integration standards to improve maintainability, reliability, and scalability.</w:t>
+        <w:rPr>
+          <w:color w:val="000000"/>
+          <w:lang w:val="en-ID"/>
+        </w:rPr>
+        <w:t xml:space="preserve">Modernized legacy platforms in phases: containerized a CodeIgniter e-procurement suite, validated a PHP 7.4→8.2 upgrade, added CI quality gates, and introduced a Laravel pilot alongside legacy code (strangler pattern); refactored the Laravel CSR platform with service layers, Larastan static analysis, and security CI checks.</w:t>
+      </w:r>
+    </w:p>
+    <w:p>
+      <w:pPr>
+        <w:pStyle w:val="ListParagraph"/>
+        <w:numPr>
+          <w:ilvl w:val="0"/>
+          <w:numId w:val="11"/>
+        </w:numPr>
+        <w:tabs>
+          <w:tab w:val="left" w:pos="8931"/>
+        </w:tabs>
+        <w:spacing w:after="0" w:line="240" w:lineRule="auto"/>
+        <w:rPr>
+          <w:color w:val="000000"/>
+          <w:lang w:val="en-ID"/>
+        </w:rPr>
+      </w:pPr>
+      <w:r>
+        <w:rPr>
+          <w:color w:val="000000"/>
+          <w:lang w:val="en-ID"/>
+        </w:rPr>
+        <w:t xml:space="preserve">Designed event-driven processing with </w:t>
+      </w:r>
+      <w:r>
+        <w:rPr>
+          <w:b/>
+          <w:bCs/>
+          <w:color w:val="000000"/>
+          <w:lang w:val="en-ID"/>
+        </w:rPr>
+        <w:t xml:space="preserve">RabbitMQ and Redis</w:t>
       </w:r>
       <w:r>
         <w:rPr>
           <w:color w:val="000000"/>
           <w:lang w:val="en-ID"/>
         </w:rPr>
-        <w:br/>
+        <w:t xml:space="preserve">, lead incident root-cause analysis for production systems, and use </w:t>
+      </w:r>
+      <w:r>
+        <w:rPr>
+          <w:b/>
+          <w:bCs/>
+          <w:color w:val="000000"/>
+          <w:lang w:val="en-ID"/>
+        </w:rPr>
+        <w:t xml:space="preserve">Claude Code and OpenAI Codex</w:t>
+      </w:r>
+      <w:r>
+        <w:rPr>
+          <w:color w:val="000000"/>
+          <w:lang w:val="en-ID"/>
+        </w:rPr>
+        <w:t xml:space="preserve"> daily for AI-assisted development with human review.</w:t>
+      </w:r>
+    </w:p>
+    <w:p>
+      <w:pPr>
+        <w:tabs>
+          <w:tab w:val="left" w:pos="8931"/>
+        </w:tabs>
+        <w:spacing w:after="0" w:line="240" w:lineRule="auto"/>
+        <w:jc w:val="both"/>
+        <w:rPr>
+          <w:sz w:val="22"/>
+          <w:szCs w:val="22"/>
+        </w:rPr>
+      </w:pPr>
+      <w:r>
+        <w:rPr>
+          <w:b/>
+          <w:sz w:val="22"/>
+          <w:szCs w:val="22"/>
+        </w:rPr>
+        <w:t xml:space="preserve">MeatLink.id </w:t>
+      </w:r>
+      <w:r>
+        <w:rPr>
+          <w:b/>
+          <w:bCs/>
+          <w:sz w:val="22"/>
+          <w:szCs w:val="22"/>
+        </w:rPr>
+        <w:t xml:space="preserve">| </w:t>
+      </w:r>
+      <w:r>
+        <w:rPr>
+          <w:b/>
+          <w:bCs/>
+        </w:rPr>
+        <w:t xml:space="preserve">B2B Meat Sourcing &amp; Commerce Platform</w:t>
+      </w:r>
+      <w:r>
+        <w:rPr>
+          <w:sz w:val="22"/>
+          <w:szCs w:val="22"/>
+        </w:rPr>
+        <w:tab/>
+      </w:r>
+    </w:p>
+    <w:p>
+      <w:pPr>
+        <w:tabs>
+          <w:tab w:val="left" w:pos="8931"/>
+        </w:tabs>
+        <w:spacing w:after="0" w:line="240" w:lineRule="auto"/>
+        <w:jc w:val="both"/>
+        <w:rPr>
+          <w:sz w:val="22"/>
+          <w:szCs w:val="22"/>
+        </w:rPr>
+      </w:pPr>
+      <w:r>
+        <w:rPr>
+          <w:b/>
+        </w:rPr>
+        <w:t xml:space="preserve">Co-founder &amp; Technology Lead</w:t>
+      </w:r>
+      <w:r>
+        <w:rPr>
+          <w:sz w:val="22"/>
+          <w:szCs w:val="22"/>
+        </w:rPr>
+        <w:t xml:space="preserve"> </w:t>
+      </w:r>
+      <w:r>
+        <w:rPr>
+          <w:b/>
+          <w:bCs/>
+        </w:rPr>
+        <w:t xml:space="preserve">| </w:t>
+      </w:r>
+      <w:r>
+        <w:rPr>
+          <w:b/>
+          <w:bCs/>
+          <w:sz w:val="22"/>
+          <w:szCs w:val="22"/>
+        </w:rPr>
+        <w:t xml:space="preserve">Aug 2026–Present</w:t>
+      </w:r>
+    </w:p>
+    <w:p>
+      <w:pPr>
+        <w:pStyle w:val="ListParagraph"/>
+        <w:numPr>
+          <w:ilvl w:val="0"/>
+          <w:numId w:val="11"/>
+        </w:numPr>
+        <w:tabs>
+          <w:tab w:val="left" w:pos="8931"/>
+        </w:tabs>
+        <w:spacing w:after="0" w:line="240" w:lineRule="auto"/>
+        <w:rPr>
+          <w:color w:val="000000"/>
+          <w:lang w:val="en-ID"/>
+        </w:rPr>
+      </w:pPr>
+      <w:r>
+        <w:rPr>
+          <w:color w:val="000000"/>
+          <w:lang w:val="en-ID"/>
+        </w:rPr>
+        <w:t xml:space="preserve">Co-founded and lead the technology behind </w:t>
+      </w:r>
+      <w:r>
+        <w:rPr>
+          <w:b/>
+          <w:bCs/>
+          <w:color w:val="000000"/>
+          <w:lang w:val="en-ID"/>
+        </w:rPr>
+        <w:t xml:space="preserve">meatlink.id</w:t>
+      </w:r>
+      <w:r>
+        <w:rPr>
+          <w:color w:val="000000"/>
+          <w:lang w:val="en-ID"/>
+        </w:rPr>
+        <w:t xml:space="preserve">, a live B2B platform where restaurants, hotels, caterers, and retailers source meat: catalog with per-kilogram pricing, multi-item RFQs, cart and checkout with </w:t>
+      </w:r>
+      <w:r>
+        <w:rPr>
+          <w:b/>
+          <w:bCs/>
+          <w:color w:val="000000"/>
+          <w:lang w:val="en-ID"/>
+        </w:rPr>
+        <w:t xml:space="preserve">Midtrans</w:t>
+      </w:r>
+      <w:r>
+        <w:rPr>
+          <w:color w:val="000000"/>
+          <w:lang w:val="en-ID"/>
+        </w:rPr>
+        <w:t xml:space="preserve"> payments, orders, invoices, and admin and vendor consoles.</w:t>
+      </w:r>
+    </w:p>
+    <w:p>
+      <w:pPr>
+        <w:pStyle w:val="ListParagraph"/>
+        <w:numPr>
+          <w:ilvl w:val="0"/>
+          <w:numId w:val="11"/>
+        </w:numPr>
+        <w:tabs>
+          <w:tab w:val="left" w:pos="8931"/>
+        </w:tabs>
+        <w:spacing w:after="0" w:line="240" w:lineRule="auto"/>
+        <w:rPr>
+          <w:color w:val="000000"/>
+          <w:lang w:val="en-ID"/>
+        </w:rPr>
+      </w:pPr>
+      <w:r>
+        <w:rPr>
+          <w:color w:val="000000"/>
+          <w:lang w:val="en-ID"/>
+        </w:rPr>
+        <w:t xml:space="preserve">Built on TanStack Start (React 19, TypeScript) on </w:t>
+      </w:r>
+      <w:r>
+        <w:rPr>
+          <w:b/>
+          <w:bCs/>
+          <w:color w:val="000000"/>
+          <w:lang w:val="en-ID"/>
+        </w:rPr>
+        <w:t xml:space="preserve">Cloudflare Workers</w:t>
+      </w:r>
+      <w:r>
+        <w:rPr>
+          <w:color w:val="000000"/>
+          <w:lang w:val="en-ID"/>
+        </w:rPr>
+        <w:t xml:space="preserve"> with </w:t>
+      </w:r>
+      <w:r>
+        <w:rPr>
+          <w:b/>
+          <w:bCs/>
+          <w:color w:val="000000"/>
+          <w:lang w:val="en-ID"/>
+        </w:rPr>
+        <w:t xml:space="preserve">Supabase Postgres</w:t>
+      </w:r>
+      <w:r>
+        <w:rPr>
+          <w:color w:val="000000"/>
+          <w:lang w:val="en-ID"/>
+        </w:rPr>
+        <w:t xml:space="preserve">, enforcing Row-Level Security per role (buyer, vendor, admin) verified against an RLS test matrix; hardened payments with webhook handling, expiry sync, and daily reconciliation.</w:t>
+      </w:r>
+    </w:p>
+    <w:p>
+      <w:pPr>
+        <w:pStyle w:val="ListParagraph"/>
+        <w:numPr>
+          <w:ilvl w:val="0"/>
+          <w:numId w:val="11"/>
+        </w:numPr>
+        <w:tabs>
+          <w:tab w:val="left" w:pos="8931"/>
+        </w:tabs>
+        <w:spacing w:after="0" w:line="240" w:lineRule="auto"/>
+        <w:rPr>
+          <w:color w:val="000000"/>
+          <w:lang w:val="en-ID"/>
+        </w:rPr>
+      </w:pPr>
+      <w:r>
+        <w:rPr>
+          <w:color w:val="000000"/>
+          <w:lang w:val="en-ID"/>
+        </w:rPr>
+        <w:t xml:space="preserve">Designed an </w:t>
+      </w:r>
+      <w:r>
+        <w:rPr>
+          <w:b/>
+          <w:bCs/>
+          <w:color w:val="000000"/>
+          <w:lang w:val="en-ID"/>
+        </w:rPr>
+        <w:t xml:space="preserve">OAuth 2.1-protected MCP server</w:t>
+      </w:r>
+      <w:r>
+        <w:rPr>
+          <w:color w:val="000000"/>
+          <w:lang w:val="en-ID"/>
+        </w:rPr>
+        <w:t xml:space="preserve"> so AI agents can check stock, place and look up orders, and draft market insights; a separate Codex research agent turns FAOSTAT, USDA, and Indonesian public data into bilingual drafts behind evidence, privacy, and human-review gates, with no database credentials.</w:t>
       </w:r>
     </w:p>
     <w:p>
@@ -553,14 +923,7 @@
           <w:b/>
           <w:bCs/>
         </w:rPr>
-        <w:t>|</w:t>
-      </w:r>
-      <w:r>
-        <w:rPr>
-          <w:b/>
-          <w:bCs/>
-        </w:rPr>
-        <w:t xml:space="preserve"> </w:t>
+        <w:t xml:space="preserve">| </w:t>
       </w:r>
       <w:r>
         <w:rPr>
@@ -596,7 +959,7 @@
         </w:rPr>
       </w:pPr>
       <w:r>
-        <w:t>Built an automated backend reporting engine for MyOrbit modem status reporting to Telkom, cutting report runtime by ~70% and improving reliability of scheduled data delivery.</w:t>
+        <w:t xml:space="preserve">Built an automated backend reporting engine for MyOrbit modem status reporting to Telkom, cutting report runtime by ~70% and improving reliability of scheduled data delivery.</w:t>
       </w:r>
       <w:r>
         <w:rPr>
@@ -715,7 +1078,7 @@
         </w:rPr>
       </w:pPr>
       <w:r>
-        <w:t>Led a 3-person squad to deliver an LMS for Nutricia Professional, Danone’s medical-professional program, launching on schedule and scaling to thousands of doctors.</w:t>
+        <w:t xml:space="preserve">Led a 3-person squad to deliver an LMS for Nutricia Professional, Danone’s medical-professional program, launching on schedule and scaling to thousands of doctors.</w:t>
       </w:r>
       <w:r>
         <w:rPr>
@@ -771,21 +1134,7 @@
           <w:b/>
           <w:color w:val="000000"/>
         </w:rPr>
-        <w:t xml:space="preserve">by </w:t>
-      </w:r>
-      <w:r>
-        <w:rPr>
-          <w:b/>
-          <w:color w:val="000000"/>
-        </w:rPr>
-        <w:t>~</w:t>
-      </w:r>
-      <w:r>
-        <w:rPr>
-          <w:b/>
-          <w:color w:val="000000"/>
-        </w:rPr>
-        <w:t>50%</w:t>
+        <w:t xml:space="preserve">by ~50%</w:t>
       </w:r>
       <w:r>
         <w:rPr>
@@ -881,27 +1230,14 @@
         <w:rPr>
           <w:b/>
         </w:rPr>
-        <w:t>IT Business Support &amp; App Delivery</w:t>
-      </w:r>
-      <w:r>
-        <w:rPr>
-          <w:b/>
-        </w:rPr>
-        <w:t xml:space="preserve"> </w:t>
+        <w:t xml:space="preserve">IT Business Support &amp; App Delivery </w:t>
       </w:r>
       <w:r>
         <w:rPr>
           <w:b/>
           <w:bCs/>
         </w:rPr>
-        <w:t>|</w:t>
-      </w:r>
-      <w:r>
-        <w:rPr>
-          <w:b/>
-          <w:bCs/>
-        </w:rPr>
-        <w:t xml:space="preserve"> </w:t>
+        <w:t xml:space="preserve">| </w:t>
       </w:r>
       <w:r>
         <w:rPr>
@@ -1043,10 +1379,13 @@
           <w:b/>
           <w:bCs/>
         </w:rPr>
-        <w:t>Earlier Experience: Digital Operations, Web Developer Internship, and University Promotion Team roles | 2015–2018</w:t>
+        <w:t xml:space="preserve">Earlier Experience: </w:t>
+      </w:r>
+      <w:r>
+        <w:rPr/>
+        <w:t xml:space="preserve">Digital Operations, PT Global Technology Resources ID (2017–2018); Web Developer Intern, Huma Shadian (2016); University Promotion Team, Bina Nusantara University (2015–2016)</w:t>
       </w:r>
     </w:p>
-    <w:p/>
     <w:p>
       <w:pPr>
         <w:pStyle w:val="Heading1"/>
@@ -1123,49 +1462,14 @@
           <w:b/>
           <w:color w:val="000000"/>
         </w:rPr>
-        <w:t>Awarded</w:t>
-      </w:r>
-      <w:r>
-        <w:rPr>
-          <w:b/>
-          <w:color w:val="000000"/>
-        </w:rPr>
-        <w:t xml:space="preserve"> (</w:t>
-      </w:r>
-      <w:r>
-        <w:rPr>
-          <w:b/>
-          <w:color w:val="000000"/>
-        </w:rPr>
-        <w:t>4</w:t>
-      </w:r>
-      <w:r>
-        <w:rPr>
-          <w:b/>
-          <w:color w:val="000000"/>
-        </w:rPr>
-        <w:t xml:space="preserve">x) – </w:t>
+        <w:t xml:space="preserve">Silver Award (4x) – </w:t>
       </w:r>
       <w:r>
         <w:rPr>
           <w:bCs/>
           <w:color w:val="000000"/>
         </w:rPr>
-        <w:t>Pertamina Sub-Holding Gas Continuous Improvement Program (2023–202</w:t>
-      </w:r>
-      <w:r>
-        <w:rPr>
-          <w:bCs/>
-          <w:color w:val="000000"/>
-        </w:rPr>
-        <w:t>5</w:t>
-      </w:r>
-      <w:r>
-        <w:rPr>
-          <w:bCs/>
-          <w:color w:val="000000"/>
-        </w:rPr>
-        <w:t>)</w:t>
+        <w:t xml:space="preserve">Pertamina Sub-Holding Gas Continuous Improvement Program (2023–2025)</w:t>
       </w:r>
     </w:p>
     <w:p>
@@ -1193,14 +1497,14 @@
         <w:t>DNDMind</w:t>
       </w:r>
       <w:r>
-        <w:t xml:space="preserve"> — Built a full-stack AI Dungeon Master co-pilot using Next.js, ASP.NET Core, FastAPI, PostgreSQL + pgvector, Docker Compose, RAG, embeddings, memory retrieval, structured AI outputs, tool/function calling, and deterministic evaluation workflows. Demo: </w:t>
+        <w:t xml:space="preserve"> — Full-stack AI Dungeon Master co-pilot (Next.js, ASP.NET Core, FastAPI, PostgreSQL + pgvector) with RAG over separate rules and homebrew indices, long-term campaign memory, tool calling, structured outputs, and a deterministic evaluation suite; deployed on Google Cloud Run. Case study: </w:t>
       </w:r>
       <w:hyperlink r:id="rId10" w:history="1">
         <w:r>
           <w:rPr>
             <w:rStyle w:val="Hyperlink"/>
           </w:rPr>
-          <w:t>https://sink.cool/dndmind</w:t>
+          <w:t>revanza.dev/projects/dndmind-ai-copilot</w:t>
         </w:r>
       </w:hyperlink>
       <w:r>
@@ -1211,7 +1515,7 @@
           <w:rPr>
             <w:rStyle w:val="Hyperlink"/>
           </w:rPr>
-          <w:t>https://github.com/revanza-git/dndmind</w:t>
+          <w:t>github.com/revanza-git/dndmind</w:t>
         </w:r>
       </w:hyperlink>
     </w:p>
@@ -1249,7 +1553,31 @@
         <w:jc w:val="both"/>
       </w:pPr>
       <w:r>
-        <w:t>Python, C#, PHP, ASP.NET Core, Laravel, RESTful API Design, Backend Architecture, Modular Architecture, Service Integration</w:t>
+        <w:t xml:space="preserve">C#/.NET (ASP.NET Core, Blazor, EF Core), PHP (Laravel, CodeIgniter), Python (FastAPI), TypeScript/Node.js, RESTful API Design, Clean Architecture, Legacy Modernization, Service Integration</w:t>
+      </w:r>
+    </w:p>
+    <w:p>
+      <w:pPr>
+        <w:spacing w:after="0" w:line="240" w:lineRule="auto"/>
+        <w:jc w:val="both"/>
+      </w:pPr>
+    </w:p>
+    <w:p>
+      <w:pPr>
+        <w:spacing w:after="0" w:line="240" w:lineRule="auto"/>
+        <w:jc w:val="both"/>
+      </w:pPr>
+      <w:r>
+        <w:t xml:space="preserve">Frontend</w:t>
+      </w:r>
+    </w:p>
+    <w:p>
+      <w:pPr>
+        <w:spacing w:after="0" w:line="240" w:lineRule="auto"/>
+        <w:jc w:val="both"/>
+      </w:pPr>
+      <w:r>
+        <w:t xml:space="preserve">React, Next.js, TypeScript, TanStack Start, Tailwind CSS, Blazor</w:t>
       </w:r>
     </w:p>
     <w:p>
@@ -1273,7 +1601,7 @@
         <w:jc w:val="both"/>
       </w:pPr>
       <w:r>
-        <w:t>PostgreSQL, SQL Server, MySQL, BigQuery, Query Optimization, Data Integration, Reporting Data Stores, Power BI, Microsoft Fabric</w:t>
+        <w:t xml:space="preserve">PostgreSQL, SQL Server, Oracle, MySQL, BigQuery, Supabase, Query Optimization, Data Integration, Reporting Data Stores, Power BI, Microsoft Fabric</w:t>
       </w:r>
     </w:p>
     <w:p>
@@ -1297,7 +1625,7 @@
         <w:jc w:val="both"/>
       </w:pPr>
       <w:r>
-        <w:t>RabbitMQ, Apache Airflow, Apache NiFi, Apache Spark, Event-Driven Workflows, Scheduled Processing, Snapshot Pipelines</w:t>
+        <w:t xml:space="preserve">RabbitMQ, Redis, Apache Airflow, Apache Spark, Apache NiFi, Event-Driven Workflows, Scheduled Processing, Snapshot Pipelines</w:t>
       </w:r>
     </w:p>
     <w:p>
@@ -1321,13 +1649,7 @@
         <w:jc w:val="both"/>
       </w:pPr>
       <w:r>
-        <w:t>LLM API Integration, On-Premise</w:t>
-      </w:r>
-      <w:r>
-        <w:t>s</w:t>
-      </w:r>
-      <w:r>
-        <w:t xml:space="preserve"> LLM Deployment, RAG, Prompt Engineering, Embedding Pipelines, Vector Retrieval, pgvector, Output Handling, AI-Assisted Development</w:t>
+        <w:t xml:space="preserve">RAG, Embedding Pipelines, Vector Retrieval (pgvector), Prompt Orchestration, MCP Servers, Tool/Function Calling, Structured Outputs, LLM Evaluation, On-Premises LLM Deployment, AI-Assisted Development (Claude Code, OpenAI Codex)</w:t>
       </w:r>
     </w:p>
     <w:p>
@@ -1342,7 +1664,7 @@
         <w:jc w:val="both"/>
       </w:pPr>
       <w:r>
-        <w:t>Cloud, DevOps &amp; Delivery</w:t>
+        <w:t xml:space="preserve">Cloud, DevOps &amp; Testing</w:t>
       </w:r>
     </w:p>
     <w:p>
@@ -1357,7 +1679,7 @@
         <w:rPr>
           <w:lang w:val="en-ID"/>
         </w:rPr>
-        <w:t>Docker, AWS EC2, Microsoft Azure, Windows Server/IIS, CI/CD, GitHub Actions, GitLab CI</w:t>
+        <w:t xml:space="preserve">Docker, Nginx, Cloudflare Workers, Google Cloud Run, Microsoft Azure, AWS EC2, Windows Server/IIS, CI/CD (GitHub Actions, GitLab CI), xUnit, PHPUnit, Vitest, Larastan, k6</w:t>
       </w:r>
     </w:p>
     <w:p>
@@ -3266,6 +3588,7 @@
   <w:style w:type="character" w:default="1" w:styleId="DefaultParagraphFont">
     <w:name w:val="Default Paragraph Font"/>
     <w:uiPriority w:val="1"/>
+    <w:semiHidden/>
     <w:unhideWhenUsed/>
   </w:style>
   <w:style w:type="table" w:default="1" w:styleId="TableNormal">

</xml_diff>